<commit_message>
Unit 3: Application Development and Admin
</commit_message>
<xml_diff>
--- a/CS 3305 - Web Programming 2/week 3/assignments/Assignment Activity Unit 3.docx
+++ b/CS 3305 - Web Programming 2/week 3/assignments/Assignment Activity Unit 3.docx
@@ -834,61 +834,7 @@
           <w:effect w:val="none"/>
           <w:shd w:fill="auto" w:val="clear"/>
         </w:rPr>
-        <w:t xml:space="preserve">April </w:t>
-      </w:r>
-      <w:r>
-        <w:rPr>
-          <w:rFonts w:ascii="Times New Roman" w:hAnsi="Times New Roman"/>
-          <w:b w:val="false"/>
-          <w:i w:val="false"/>
-          <w:caps w:val="false"/>
-          <w:smallCaps w:val="false"/>
-          <w:strike w:val="false"/>
-          <w:dstrike w:val="false"/>
-          <w:color w:val="000000"/>
-          <w:sz w:val="24"/>
-          <w:szCs w:val="24"/>
-          <w:u w:val="none"/>
-          <w:effect w:val="none"/>
-          <w:shd w:fill="auto" w:val="clear"/>
-        </w:rPr>
-        <w:t>2</w:t>
-      </w:r>
-      <w:r>
-        <w:rPr>
-          <w:rFonts w:ascii="Times New Roman" w:hAnsi="Times New Roman"/>
-          <w:b w:val="false"/>
-          <w:i w:val="false"/>
-          <w:caps w:val="false"/>
-          <w:smallCaps w:val="false"/>
-          <w:strike w:val="false"/>
-          <w:dstrike w:val="false"/>
-          <w:color w:val="000000"/>
-          <w:sz w:val="24"/>
-          <w:szCs w:val="24"/>
-          <w:u w:val="none"/>
-          <w:effect w:val="none"/>
-          <w:shd w:fill="auto" w:val="clear"/>
-        </w:rPr>
-        <w:t>9</w:t>
-      </w:r>
-      <w:r>
-        <w:rPr>
-          <w:rFonts w:ascii="Times New Roman" w:hAnsi="Times New Roman"/>
-          <w:b w:val="false"/>
-          <w:i w:val="false"/>
-          <w:caps w:val="false"/>
-          <w:smallCaps w:val="false"/>
-          <w:strike w:val="false"/>
-          <w:dstrike w:val="false"/>
-          <w:color w:val="000000"/>
-          <w:sz w:val="24"/>
-          <w:szCs w:val="24"/>
-          <w:u w:val="none"/>
-          <w:effect w:val="none"/>
-          <w:shd w:fill="auto" w:val="clear"/>
-        </w:rPr>
-        <w:t xml:space="preserve"> 2026</w:t>
+        <w:t>April 29 2026</w:t>
       </w:r>
     </w:p>
     <w:p>
@@ -1039,55 +985,7 @@
           <w:sz w:val="24"/>
           <w:szCs w:val="24"/>
         </w:rPr>
-        <w:t xml:space="preserve">Reusable </w:t>
-      </w:r>
-      <w:r>
-        <w:rPr>
-          <w:rFonts w:ascii="Times New Roman" w:hAnsi="Times New Roman"/>
-          <w:sz w:val="24"/>
-          <w:szCs w:val="24"/>
-        </w:rPr>
-        <w:t>f</w:t>
-      </w:r>
-      <w:r>
-        <w:rPr>
-          <w:rFonts w:ascii="Times New Roman" w:hAnsi="Times New Roman"/>
-          <w:sz w:val="24"/>
-          <w:szCs w:val="24"/>
-        </w:rPr>
-        <w:t xml:space="preserve">unctions for </w:t>
-      </w:r>
-      <w:r>
-        <w:rPr>
-          <w:rFonts w:ascii="Times New Roman" w:hAnsi="Times New Roman"/>
-          <w:sz w:val="24"/>
-          <w:szCs w:val="24"/>
-        </w:rPr>
-        <w:t>m</w:t>
-      </w:r>
-      <w:r>
-        <w:rPr>
-          <w:rFonts w:ascii="Times New Roman" w:hAnsi="Times New Roman"/>
-          <w:sz w:val="24"/>
-          <w:szCs w:val="24"/>
-        </w:rPr>
-        <w:t xml:space="preserve">odular </w:t>
-      </w:r>
-      <w:r>
-        <w:rPr>
-          <w:rFonts w:ascii="Times New Roman" w:hAnsi="Times New Roman"/>
-          <w:sz w:val="24"/>
-          <w:szCs w:val="24"/>
-        </w:rPr>
-        <w:t>c</w:t>
-      </w:r>
-      <w:r>
-        <w:rPr>
-          <w:rFonts w:ascii="Times New Roman" w:hAnsi="Times New Roman"/>
-          <w:sz w:val="24"/>
-          <w:szCs w:val="24"/>
-        </w:rPr>
-        <w:t>ode</w:t>
+        <w:t>Reusable functions for modular code</w:t>
       </w:r>
     </w:p>
     <w:p>
@@ -1107,23 +1005,7 @@
           <w:szCs w:val="24"/>
         </w:rPr>
         <w:tab/>
-        <w:t xml:space="preserve">The </w:t>
-      </w:r>
-      <w:r>
-        <w:rPr>
-          <w:rFonts w:ascii="Times New Roman" w:hAnsi="Times New Roman"/>
-          <w:sz w:val="24"/>
-          <w:szCs w:val="24"/>
-        </w:rPr>
-        <w:t>first question</w:t>
-      </w:r>
-      <w:r>
-        <w:rPr>
-          <w:rFonts w:ascii="Times New Roman" w:hAnsi="Times New Roman"/>
-          <w:sz w:val="24"/>
-          <w:szCs w:val="24"/>
-        </w:rPr>
-        <w:t xml:space="preserve"> demonstrates the importance of modular programming through three distinct functions that address common e-commerce scenarios. The calculateTotal() function implements tax calculation logic that can be reused across different product types and order scenarios. By accepting price and quantity as parameters and applying a consistent 10% sales tax, this function eliminates code duplication and ensures accurate pricing throughout the application. Similarly, the formatProductName() function handles text formatting requirements, using the trim() function to remove whitespace, ucwords() to capitalize words, and substr() to enforce length constraints, operations that are frequently needed when displaying product information across various interface components (McGrath, 2021). The third function, calculateDiscount(), provides a reusable mechanism for applying percentage-based discounts, utilizing the number_format() function to ensure proper currency display (McGrath, 2021). These modular functions exemplify best practices in PHP development by encapsulating specific functionality, promoting code reusability, and making maintenance more manageable.</w:t>
+        <w:t>The first question demonstrates the importance of modular programming through three distinct functions that address common e-commerce scenarios. The calculateTotal() function implements tax calculation logic that can be reused across different product types and order scenarios. By accepting price and quantity as parameters and applying a consistent 10% sales tax, this function eliminates code duplication and ensures accurate pricing throughout the application. Similarly, the formatProductName() function handles text formatting requirements, using the trim() function to remove whitespace, ucwords() to capitalize words, and substr() to enforce length constraints, operations that are frequently needed when displaying product information across various interface components (McGrath, 2021). The third function, calculateDiscount(), provides a reusable mechanism for applying percentage-based discounts, utilizing the number_format() function to ensure proper currency display (McGrath, 2021). These modular functions exemplify best practices in PHP development by encapsulating specific functionality, promoting code reusability, and making maintenance more manageable.</w:t>
       </w:r>
     </w:p>
     <w:p>
@@ -1147,71 +1029,7 @@
           <w:sz w:val="24"/>
           <w:szCs w:val="24"/>
         </w:rPr>
-        <w:t xml:space="preserve">Array </w:t>
-      </w:r>
-      <w:r>
-        <w:rPr>
-          <w:rFonts w:ascii="Times New Roman" w:hAnsi="Times New Roman"/>
-          <w:sz w:val="24"/>
-          <w:szCs w:val="24"/>
-        </w:rPr>
-        <w:t>m</w:t>
-      </w:r>
-      <w:r>
-        <w:rPr>
-          <w:rFonts w:ascii="Times New Roman" w:hAnsi="Times New Roman"/>
-          <w:sz w:val="24"/>
-          <w:szCs w:val="24"/>
-        </w:rPr>
-        <w:t xml:space="preserve">anipulation </w:t>
-      </w:r>
-      <w:r>
-        <w:rPr>
-          <w:rFonts w:ascii="Times New Roman" w:hAnsi="Times New Roman"/>
-          <w:sz w:val="24"/>
-          <w:szCs w:val="24"/>
-        </w:rPr>
-        <w:t>u</w:t>
-      </w:r>
-      <w:r>
-        <w:rPr>
-          <w:rFonts w:ascii="Times New Roman" w:hAnsi="Times New Roman"/>
-          <w:sz w:val="24"/>
-          <w:szCs w:val="24"/>
-        </w:rPr>
-        <w:t xml:space="preserve">sing </w:t>
-      </w:r>
-      <w:r>
-        <w:rPr>
-          <w:rFonts w:ascii="Times New Roman" w:hAnsi="Times New Roman"/>
-          <w:sz w:val="24"/>
-          <w:szCs w:val="24"/>
-        </w:rPr>
-        <w:t>b</w:t>
-      </w:r>
-      <w:r>
-        <w:rPr>
-          <w:rFonts w:ascii="Times New Roman" w:hAnsi="Times New Roman"/>
-          <w:sz w:val="24"/>
-          <w:szCs w:val="24"/>
-        </w:rPr>
-        <w:t xml:space="preserve">uilt-in PHP </w:t>
-      </w:r>
-      <w:r>
-        <w:rPr>
-          <w:rFonts w:ascii="Times New Roman" w:hAnsi="Times New Roman"/>
-          <w:sz w:val="24"/>
-          <w:szCs w:val="24"/>
-        </w:rPr>
-        <w:t>f</w:t>
-      </w:r>
-      <w:r>
-        <w:rPr>
-          <w:rFonts w:ascii="Times New Roman" w:hAnsi="Times New Roman"/>
-          <w:sz w:val="24"/>
-          <w:szCs w:val="24"/>
-        </w:rPr>
-        <w:t>unctions</w:t>
+        <w:t>Array manipulation using built-in PHP functions</w:t>
       </w:r>
     </w:p>
     <w:p>
@@ -1231,23 +1049,7 @@
           <w:szCs w:val="24"/>
         </w:rPr>
         <w:tab/>
-        <w:t xml:space="preserve">The second </w:t>
-      </w:r>
-      <w:r>
-        <w:rPr>
-          <w:rFonts w:ascii="Times New Roman" w:hAnsi="Times New Roman"/>
-          <w:sz w:val="24"/>
-          <w:szCs w:val="24"/>
-        </w:rPr>
-        <w:t>question</w:t>
-      </w:r>
-      <w:r>
-        <w:rPr>
-          <w:rFonts w:ascii="Times New Roman" w:hAnsi="Times New Roman"/>
-          <w:sz w:val="24"/>
-          <w:szCs w:val="24"/>
-        </w:rPr>
-        <w:t xml:space="preserve"> showcases advanced array manipulation techniques essential for managing product inventories and customer data. The implementation demonstrates sophisticated handling of product arrays, including duplicate removal using associative array conversion, custom sorting with the usort() function for price-based ordering, and array merging using the array_merge() function for combining supplier inventories (McGrath, 2021). The code effectively utilizes PHP's built-in array functions to solve complex business logic challenges, such as applying category-specific discounts to electronics products while maintaining data integrity across different product categories. The use of array_merge() combined with custom duplicate removal logic illustrates how to handle real-world scenarios where data from multiple sources needs to be consolidated efficiently. The array_values() function is employed to convert associative arrays back to indexed arrays (McGrath, 2021), ensuring proper data structure consistency. These array manipulation techniques are fundamental to e-commerce applications, where product catalogs, shopping carts, and order histories must be processed and displayed dynamically.</w:t>
+        <w:t>The second question showcases advanced array manipulation techniques essential for managing product inventories and customer data. The implementation demonstrates sophisticated handling of product arrays, including duplicate removal using associative array conversion, custom sorting with the usort() function for price-based ordering, and array merging using the array_merge() function for combining supplier inventories (McGrath, 2021). The code effectively utilizes PHP's built-in array functions to solve complex business logic challenges, such as applying category-specific discounts to electronics products while maintaining data integrity across different product categories. The use of array_merge() combined with custom duplicate removal logic illustrates how to handle real-world scenarios where data from multiple sources needs to be consolidated efficiently. The array_values() function is employed to convert associative arrays back to indexed arrays (McGrath, 2021), ensuring proper data structure consistency. These array manipulation techniques are fundamental to e-commerce applications, where product catalogs, shopping carts, and order histories must be processed and displayed dynamically.</w:t>
       </w:r>
     </w:p>
     <w:p>
@@ -1271,107 +1073,124 @@
           <w:sz w:val="24"/>
           <w:szCs w:val="24"/>
         </w:rPr>
-        <w:t xml:space="preserve">String </w:t>
-      </w:r>
-      <w:r>
-        <w:rPr>
-          <w:rFonts w:ascii="Times New Roman" w:hAnsi="Times New Roman"/>
-          <w:sz w:val="24"/>
-          <w:szCs w:val="24"/>
-        </w:rPr>
-        <w:t>m</w:t>
-      </w:r>
-      <w:r>
-        <w:rPr>
-          <w:rFonts w:ascii="Times New Roman" w:hAnsi="Times New Roman"/>
-          <w:sz w:val="24"/>
-          <w:szCs w:val="24"/>
-        </w:rPr>
-        <w:t xml:space="preserve">anipulation </w:t>
-      </w:r>
-      <w:r>
-        <w:rPr>
-          <w:rFonts w:ascii="Times New Roman" w:hAnsi="Times New Roman"/>
-          <w:sz w:val="24"/>
-          <w:szCs w:val="24"/>
-        </w:rPr>
-        <w:t>f</w:t>
-      </w:r>
-      <w:r>
-        <w:rPr>
-          <w:rFonts w:ascii="Times New Roman" w:hAnsi="Times New Roman"/>
-          <w:sz w:val="24"/>
-          <w:szCs w:val="24"/>
-        </w:rPr>
-        <w:t xml:space="preserve">unctions for </w:t>
-      </w:r>
-      <w:r>
-        <w:rPr>
-          <w:rFonts w:ascii="Times New Roman" w:hAnsi="Times New Roman"/>
-          <w:sz w:val="24"/>
-          <w:szCs w:val="24"/>
-        </w:rPr>
-        <w:t>t</w:t>
-      </w:r>
-      <w:r>
-        <w:rPr>
-          <w:rFonts w:ascii="Times New Roman" w:hAnsi="Times New Roman"/>
-          <w:sz w:val="24"/>
-          <w:szCs w:val="24"/>
-        </w:rPr>
-        <w:t xml:space="preserve">ext </w:t>
-      </w:r>
-      <w:r>
-        <w:rPr>
-          <w:rFonts w:ascii="Times New Roman" w:hAnsi="Times New Roman"/>
-          <w:sz w:val="24"/>
-          <w:szCs w:val="24"/>
-        </w:rPr>
-        <w:t>p</w:t>
-      </w:r>
-      <w:r>
-        <w:rPr>
-          <w:rFonts w:ascii="Times New Roman" w:hAnsi="Times New Roman"/>
-          <w:sz w:val="24"/>
-          <w:szCs w:val="24"/>
-        </w:rPr>
-        <w:t>rocessing</w:t>
-      </w:r>
-    </w:p>
-    <w:p>
-      <w:pPr>
-        <w:pStyle w:val="BodyText"/>
-        <w:spacing w:lineRule="auto" w:line="480"/>
-        <w:rPr>
-          <w:rFonts w:ascii="Times New Roman" w:hAnsi="Times New Roman"/>
-          <w:sz w:val="24"/>
-          <w:szCs w:val="24"/>
-        </w:rPr>
-      </w:pPr>
-      <w:r>
-        <w:rPr>
-          <w:rFonts w:ascii="Times New Roman" w:hAnsi="Times New Roman"/>
-          <w:sz w:val="24"/>
-          <w:szCs w:val="24"/>
-        </w:rPr>
-        <w:tab/>
-        <w:t xml:space="preserve">The third </w:t>
-      </w:r>
-      <w:r>
-        <w:rPr>
-          <w:rFonts w:ascii="Times New Roman" w:hAnsi="Times New Roman"/>
-          <w:sz w:val="24"/>
-          <w:szCs w:val="24"/>
-        </w:rPr>
-        <w:t>question</w:t>
-      </w:r>
-      <w:r>
-        <w:rPr>
-          <w:rFonts w:ascii="Times New Roman" w:hAnsi="Times New Roman"/>
-          <w:sz w:val="24"/>
-          <w:szCs w:val="24"/>
-        </w:rPr>
-        <w:t xml:space="preserve"> focuses on text processing capabilities critical for user-generated content management and data sanitization. The assignment implements comprehensive string manipulation functions that handle product description formatting, customer review analysis, and content extraction. The sanitizeProductDescription() function demonstrates advanced regex usage through the preg_replace() function to clean distorted text, using strtolower() to convert uppercase to lowercase, str_replace() to replace underscores with spaces, and removing unnecessary special characters while preserving essential punctuation (McGrath, 2021). The analyzeDescription() function showcases text analysis capabilities, using the strlen() function to count characters, str_word_count() to count words, and stripos() to perform case-insensitive keyword searches (McGrath, 2021). Finally, the analyzeReview() function illustrates content preview generation using the substr() function and keyword positioning with the str_contains() and strpos() functions (McGrath, 2021), essential features for displaying customer feedback on product pages. These string manipulation techniques ensure data consistency, improve user experience, and maintain content quality across the e-commerce platform.</w:t>
+        <w:t>String manipulation functions for text processing</w:t>
+      </w:r>
+    </w:p>
+    <w:p>
+      <w:pPr>
+        <w:pStyle w:val="BodyText"/>
+        <w:spacing w:lineRule="auto" w:line="480"/>
+        <w:rPr>
+          <w:rFonts w:ascii="Times New Roman" w:hAnsi="Times New Roman"/>
+          <w:sz w:val="24"/>
+          <w:szCs w:val="24"/>
+        </w:rPr>
+      </w:pPr>
+      <w:r>
+        <w:rPr>
+          <w:rFonts w:ascii="Times New Roman" w:hAnsi="Times New Roman"/>
+          <w:sz w:val="24"/>
+          <w:szCs w:val="24"/>
+        </w:rPr>
+        <w:t>The third question focuses on text processing capabilities critical for user-generated content management and data sanitization. The assignment implements comprehensive string manipulation functions that handle product description formatting, customer review analysis, and content extraction. The sanitizeProductDescription() function demonstrates advanced regex usage through the preg_replace() function to clean distorted text, using strtolower() to convert uppercase to lowercase, str_replace() to replace underscores with spaces, and removing unnecessary special characters while preserving essential punctuation (McGrath, 2021). The analyzeDescription() function showcases text analysis capabilities, using the strlen() function to count characters, str_word_count() to count words, and stripos() to perform case-insensitive keyword searches (McGrath, 2021). Finally, the analyzeReview() function illustrates content preview generation using the substr() function and keyword positioning with the str_contains() and strpos() functions (McGrath, 2021), essential features for displaying customer feedback on product pages. These string manipulation techniques ensure data consistency, improve user experience, and maintain content quality across the e-commerce platform.</w:t>
+      </w:r>
+    </w:p>
+    <w:p>
+      <w:pPr>
+        <w:pStyle w:val="BodyText"/>
+        <w:spacing w:lineRule="auto" w:line="480"/>
+        <w:rPr>
+          <w:rFonts w:ascii="Times New Roman" w:hAnsi="Times New Roman"/>
+          <w:b/>
+          <w:bCs/>
+          <w:sz w:val="24"/>
+          <w:szCs w:val="24"/>
+        </w:rPr>
+      </w:pPr>
+      <w:r>
+        <w:rPr>
+          <w:rFonts w:ascii="Times New Roman" w:hAnsi="Times New Roman"/>
+          <w:b/>
+          <w:bCs/>
+          <w:sz w:val="24"/>
+          <w:szCs w:val="24"/>
+        </w:rPr>
+        <w:t>Source code:</w:t>
+      </w:r>
+    </w:p>
+    <w:p>
+      <w:pPr>
+        <w:pStyle w:val="BodyText"/>
+        <w:spacing w:lineRule="auto" w:line="480"/>
+        <w:rPr>
+          <w:rFonts w:ascii="Times New Roman" w:hAnsi="Times New Roman"/>
+          <w:sz w:val="24"/>
+          <w:szCs w:val="24"/>
+        </w:rPr>
+      </w:pPr>
+      <w:hyperlink r:id="rId2">
+        <w:r>
+          <w:rPr>
+            <w:rStyle w:val="Hyperlink"/>
+            <w:rFonts w:ascii="Times New Roman" w:hAnsi="Times New Roman"/>
+            <w:sz w:val="24"/>
+            <w:szCs w:val="24"/>
+          </w:rPr>
+          <w:t>https://github.com/Yerfdog1990/computer-science-course/blob/main/CS%203305%20-%20Web%20Programming%202/week%203/assignments/index.php</w:t>
+        </w:r>
+      </w:hyperlink>
+    </w:p>
+    <w:p>
+      <w:pPr>
+        <w:pStyle w:val="BodyText"/>
+        <w:spacing w:lineRule="auto" w:line="480"/>
+        <w:rPr>
+          <w:rFonts w:ascii="Times New Roman" w:hAnsi="Times New Roman"/>
+          <w:b/>
+          <w:bCs/>
+          <w:sz w:val="24"/>
+          <w:szCs w:val="24"/>
+        </w:rPr>
+      </w:pPr>
+      <w:r>
+        <w:rPr>
+          <w:rFonts w:ascii="Times New Roman" w:hAnsi="Times New Roman"/>
+          <w:b/>
+          <w:bCs/>
+          <w:sz w:val="24"/>
+          <w:szCs w:val="24"/>
+        </w:rPr>
+        <w:t>Log result:</w:t>
+      </w:r>
+    </w:p>
+    <w:p>
+      <w:pPr>
+        <w:pStyle w:val="BodyText"/>
+        <w:spacing w:lineRule="auto" w:line="480"/>
+        <w:rPr>
+          <w:rFonts w:ascii="Times New Roman" w:hAnsi="Times New Roman"/>
+          <w:sz w:val="24"/>
+          <w:szCs w:val="24"/>
+        </w:rPr>
+      </w:pPr>
+      <w:hyperlink r:id="rId3">
+        <w:r>
+          <w:rPr>
+            <w:rStyle w:val="Hyperlink"/>
+            <w:rFonts w:ascii="Times New Roman" w:hAnsi="Times New Roman"/>
+            <w:sz w:val="24"/>
+            <w:szCs w:val="24"/>
+          </w:rPr>
+          <w:t>https://github.com/Yerfdog1990/computer-science-course/blob/main/CS%203305%20-%20Web%20Programming%202/week%203/assignments/log%20results.pdf</w:t>
+        </w:r>
+      </w:hyperlink>
+      <w:r>
+        <w:rPr>
+          <w:rFonts w:ascii="Times New Roman" w:hAnsi="Times New Roman"/>
+          <w:sz w:val="24"/>
+          <w:szCs w:val="24"/>
+        </w:rPr>
+        <w:t xml:space="preserve"> </w:t>
       </w:r>
     </w:p>
     <w:p>
@@ -2044,8 +1863,8 @@
       <w:szCs w:val="28"/>
     </w:rPr>
   </w:style>
-  <w:style w:type="character" w:styleId="Bullets">
-    <w:name w:val="Bullets"/>
+  <w:style w:type="character" w:styleId="Bulletsuser">
+    <w:name w:val="Bullets (user)"/>
     <w:qFormat/>
     <w:rPr>
       <w:rFonts w:ascii="OpenSymbol" w:hAnsi="OpenSymbol" w:eastAsia="OpenSymbol" w:cs="OpenSymbol"/>
@@ -2066,8 +1885,8 @@
       <w:bCs/>
     </w:rPr>
   </w:style>
-  <w:style w:type="character" w:styleId="Bulletsuser">
-    <w:name w:val="Bullets (user)"/>
+  <w:style w:type="character" w:styleId="Bullets">
+    <w:name w:val="Bullets"/>
     <w:qFormat/>
     <w:rPr>
       <w:rFonts w:ascii="OpenSymbol" w:hAnsi="OpenSymbol" w:eastAsia="OpenSymbol" w:cs="OpenSymbol"/>
@@ -2221,8 +2040,8 @@
       <w:lang w:val="en-US" w:eastAsia="en-US" w:bidi="ar-SA"/>
     </w:rPr>
   </w:style>
-  <w:style w:type="paragraph" w:styleId="FrameContentsuser">
-    <w:name w:val="Frame Contents (user)"/>
+  <w:style w:type="paragraph" w:styleId="FrameContents">
+    <w:name w:val="Frame Contents"/>
     <w:basedOn w:val="Normal"/>
     <w:qFormat/>
     <w:pPr/>

</xml_diff>